<commit_message>
B1 2H: grabaciones de entrada a la auxiliar (PC de la academia), videos diarios al grupo de WhatsApp del cohorte, todos continuos (Capsula, sin Carta)
Co-Authored-By: Claude Fable 5.1 <noreply@anthropic.com>
</commit_message>
<xml_diff>
--- a/VERSION_2/B1_2H/SYLLABUS_B1_NOCTURNO_2H.docx
+++ b/VERSION_2/B1_2H/SYLLABUS_B1_NOCTURNO_2H.docx
@@ -418,7 +418,7 @@
         <w:rPr>
           <w:sz w:val="20"/>
         </w:rPr>
-        <w:t>Angie graba a cada estudiante 1-2 minutos hablando, mientras el resto trabaja. Es la foto de partida del nivel para la garantía. Se sube esa noche a la carpeta que coordinación indique.</w:t>
+        <w:t>Angie graba a cada estudiante 1-2 minutos hablando, mientras el resto trabaja. Es la foto de partida del nivel para la garantía. Esa misma noche se las envía a Jacqueline (auxiliar administrativa) por WhatsApp, una por una con el nombre, y ella las guarda en el computador de la academia.</w:t>
       </w:r>
     </w:p>
     <w:p>
@@ -437,7 +437,7 @@
         <w:rPr>
           <w:sz w:val="20"/>
         </w:rPr>
-        <w:t>cada estudiante graba un video de mínimo 3 minutos, hablado de corrido y sin leer, y lo envía el mismo día al canal del cohorte. Ya no es audio y ya no se queda en el celular. Audio solo por excepción, máximo 2 por semana. El docente del día VE los videos antes de la clase y anota al menos UNA cosa por mejorar de cada uno (una frase, con el error real). Al inicio de la clase, con la lista en mano, marca quién ENVIÓ y le dice a cada uno su mejora en voz alta, en 5 segundos. Video recibido + mejora anotada van al reporte de la noche. Es la revisión más importante del día: el video es la clase particular de cada estudiante.</w:t>
+        <w:t>cada estudiante graba un video de mínimo 3 minutos, hablado de corrido y sin leer, y lo envía el mismo día al grupo de WhatsApp del cohorte (donde están los dos docentes y Jacqueline, que los descarga y archiva por estudiante). Ya no es audio y ya no se queda en el celular. Audio solo por excepción, máximo 2 por semana. El docente del día VE los videos antes de la clase y anota al menos UNA cosa por mejorar de cada uno (una frase, con el error real). Al inicio de la clase, con la lista en mano, marca quién ENVIÓ y le dice a cada uno su mejora en voz alta, en 5 segundos. Video recibido + mejora anotada van al reporte de la noche. Es la revisión más importante del día: el video es la clase particular de cada estudiante.</w:t>
       </w:r>
     </w:p>
     <w:p>

</xml_diff>

<commit_message>
Syllabus (7): la Frase del Dia con definicion, ejemplo real de la Cl 1 y los 5 pasos minuto a minuto
Co-Authored-By: Claude Fable 5.1 <noreply@anthropic.com>
</commit_message>
<xml_diff>
--- a/VERSION_2/B1_2H/SYLLABUS_B1_NOCTURNO_2H.docx
+++ b/VERSION_2/B1_2H/SYLLABUS_B1_NOCTURNO_2H.docx
@@ -965,7 +965,7 @@
           <w:color w:val="E54C09"/>
           <w:sz w:val="23"/>
         </w:rPr>
-        <w:t>7. LO QUE NO CAMBIA</w:t>
+        <w:t>7. LOS RITUALES Y POR QUÉ EXISTEN (lo que no cambia)</w:t>
       </w:r>
     </w:p>
     <w:p>
@@ -977,7 +977,197 @@
           <w:b w:val="0"/>
           <w:sz w:val="20"/>
         </w:rPr>
-        <w:t>Frase del Día en el tablero antes de empezar (cada clase estrena la suya; la de ayer va en el PASE como referencia). Feedback diario del docente; notas y resultados solo por coordinación. Cuatro bloques largos. Cero material impreso preparado: todo en tablero o dictado. Simulación profesional con un guest, observadores con tarea y el docente como coach (nunca como guest). Tarea con hora de entrega: siempre antes de las 6:30 PM del día siguiente. Sin nombres de estudiantes en la guía; sin nombres de metodologías frente a los estudiantes.</w:t>
+        <w:t>Ninguno de estos es un capricho ni una formalidad. Cada uno resuelve un problema concreto que ya nos costó estudiantes. El docente que entiende para qué sirve cada uno, lo hace bien; el que lo ve como regla, lo recorta.</w:t>
+      </w:r>
+    </w:p>
+    <w:p>
+      <w:pPr>
+        <w:spacing w:after="40"/>
+        <w:ind w:left="283"/>
+      </w:pPr>
+      <w:r>
+        <w:rPr>
+          <w:b/>
+          <w:sz w:val="20"/>
+        </w:rPr>
+        <w:t xml:space="preserve">• La Frase del Día en el tablero, antes de que entren. </w:t>
+      </w:r>
+      <w:r>
+        <w:rPr>
+          <w:sz w:val="20"/>
+        </w:rPr>
+        <w:t>QUÉ ES: una sola oración en inglés, escrita por la academia en la guía del día (el docente no la inventa), que junta la estructura gramatical de esa clase con la virtud de la semana. Ejemplo real, Clase 1 de este cohorte (módulo: pasado cerrado vs abierto; virtud: prudencia): "Prudence weighs the clock before it speaks: what I did last year is closed, and what I have achieved this year is still open." Ahí están el simple past, el present perfect y la prudencia en una frase que se puede decir en voz alta. CÓMO SE HACE, en orden: (1) el docente la escribe en el tablero ANTES de que entren los estudiantes, arriba y grande, y ahí se queda toda la clase; (2) en el Bloque 1 la lee dos veces, el grupo la repite en coro dos veces, y un estudiante la dice solo; (3) el docente la explica en una sola línea ("two pasts in one sentence: I did closes the door, I have done leaves it open"), sin clase de gramática; (4) durante la clase el docente la usa de forma natural al menos tres veces, en lo que dice; (5) al cierre, un estudiante la dice de memoria y otro la usa en una oración propia. Total: unos 4 minutos, repartidos. Por qué: una frase que se oye, se dice y se usa diez veces en contexto se queda; una lista de veinte palabras copiadas no. Es la forma más barata de repetición espaciada que existe, y es el ancla visible de toda la clase: el estudiante distraído levanta la vista y sabe de qué se trata hoy. Reemplazó a las listas de vocabulario en cuaderno, que nadie volvía a abrir. Cada clase estrena la suya; la de ayer va en el reporte solo como referencia.</w:t>
+      </w:r>
+    </w:p>
+    <w:p>
+      <w:pPr>
+        <w:spacing w:after="40"/>
+        <w:ind w:left="283"/>
+      </w:pPr>
+      <w:r>
+        <w:rPr>
+          <w:b/>
+          <w:sz w:val="20"/>
+        </w:rPr>
+        <w:t xml:space="preserve">• El chequeo de portafolio, al abrir. </w:t>
+      </w:r>
+      <w:r>
+        <w:rPr>
+          <w:sz w:val="20"/>
+        </w:rPr>
+        <w:t>Quién envió el video y una mejora dicha en voz alta a cada uno. Por qué: es el único momento del día en que cada estudiante recibe feedback personal, y es lo que hace que el video se grabe mañana también. Un portafolio que nadie ve muere en dos semanas.</w:t>
+      </w:r>
+    </w:p>
+    <w:p>
+      <w:pPr>
+        <w:spacing w:after="40"/>
+        <w:ind w:left="283"/>
+      </w:pPr>
+      <w:r>
+        <w:rPr>
+          <w:b/>
+          <w:sz w:val="20"/>
+        </w:rPr>
+        <w:t xml:space="preserve">• La recuperación al abrir (lo de hace 3 y hace 7 clases). </w:t>
+      </w:r>
+      <w:r>
+        <w:rPr>
+          <w:sz w:val="20"/>
+        </w:rPr>
+        <w:t>Dos o tres preguntas de pie sobre lo que se vio hace tres y siete clases, antes de lo nuevo. Por qué: lo que se recupera justo cuando se está olvidando se fija para siempre; lo que se vio una sola vez se pierde en diez días. Son tres minutos que valen una clase de repaso.</w:t>
+      </w:r>
+    </w:p>
+    <w:p>
+      <w:pPr>
+        <w:spacing w:after="40"/>
+        <w:ind w:left="283"/>
+      </w:pPr>
+      <w:r>
+        <w:rPr>
+          <w:b/>
+          <w:sz w:val="20"/>
+        </w:rPr>
+        <w:t xml:space="preserve">• Cuatro bloques largos, no doce cortos. </w:t>
+      </w:r>
+      <w:r>
+        <w:rPr>
+          <w:sz w:val="20"/>
+        </w:rPr>
+        <w:t>Por qué: hablar un idioma exige tiempo sostenido en una misma situación; con actividades de ocho minutos el estudiante nunca llega a la parte difícil, que es donde se aprende.</w:t>
+      </w:r>
+    </w:p>
+    <w:p>
+      <w:pPr>
+        <w:spacing w:after="40"/>
+        <w:ind w:left="283"/>
+      </w:pPr>
+      <w:r>
+        <w:rPr>
+          <w:b/>
+          <w:sz w:val="20"/>
+        </w:rPr>
+        <w:t xml:space="preserve">• La simulación con un guest, observadores con tarea y el docente como coach (nunca como guest). </w:t>
+      </w:r>
+      <w:r>
+        <w:rPr>
+          <w:sz w:val="20"/>
+        </w:rPr>
+        <w:t>Por qué: el estudiante que hace de guest vive la situación real (una entrevista, una queja, una negociación) y los que observan trabajan con una ficha, así nadie mira el techo. Si el docente hace de guest, la simulación se vuelve una conversación con el profesor, que es justo lo que el estudiante ya sabe hacer.</w:t>
+      </w:r>
+    </w:p>
+    <w:p>
+      <w:pPr>
+        <w:spacing w:after="40"/>
+        <w:ind w:left="283"/>
+      </w:pPr>
+      <w:r>
+        <w:rPr>
+          <w:b/>
+          <w:sz w:val="20"/>
+        </w:rPr>
+        <w:t xml:space="preserve">• El error paper: anónimo en el tablero, con nombres solo para coordinación. </w:t>
+      </w:r>
+      <w:r>
+        <w:rPr>
+          <w:sz w:val="20"/>
+        </w:rPr>
+        <w:t>Por qué: el error sin nombre se corrige entre todos y nadie se avergüenza, así que la próxima vez se atreven a hablar igual; el registro con nombres le permite a coordinación ver quién repite qué y actuar antes de que se vuelva un retiro.</w:t>
+      </w:r>
+    </w:p>
+    <w:p>
+      <w:pPr>
+        <w:spacing w:after="40"/>
+        <w:ind w:left="283"/>
+      </w:pPr>
+      <w:r>
+        <w:rPr>
+          <w:b/>
+          <w:sz w:val="20"/>
+        </w:rPr>
+        <w:t xml:space="preserve">• El ticket de salida, en los últimos 5 minutos. </w:t>
+      </w:r>
+      <w:r>
+        <w:rPr>
+          <w:sz w:val="20"/>
+        </w:rPr>
+        <w:t>Tres a cinco frases escritas por cada estudiante con la estructura de hoy, con nombre, sin calificar. Por qué: es la evidencia diaria de que cada uno aprendió lo de ese día, sin depender de la opinión de nadie. Es lo que sostiene la garantía y lo que le muestra a coordinación quién va y quién no. Se recogen todos: un ticket que falta es una señal.</w:t>
+      </w:r>
+    </w:p>
+    <w:p>
+      <w:pPr>
+        <w:spacing w:after="40"/>
+        <w:ind w:left="283"/>
+      </w:pPr>
+      <w:r>
+        <w:rPr>
+          <w:b/>
+          <w:sz w:val="20"/>
+        </w:rPr>
+        <w:t xml:space="preserve">• La tarea con hora de entrega, sin excepciones. </w:t>
+      </w:r>
+      <w:r>
+        <w:rPr>
+          <w:sz w:val="20"/>
+        </w:rPr>
+        <w:t>Por qué: la constancia no se enseña con discursos, se entrena con fechas que se cumplen. Y la hora fija (antes de la clase siguiente) evita el "te lo mando después", que es el principio del abandono.</w:t>
+      </w:r>
+    </w:p>
+    <w:p>
+      <w:pPr>
+        <w:spacing w:after="40"/>
+        <w:ind w:left="283"/>
+      </w:pPr>
+      <w:r>
+        <w:rPr>
+          <w:b/>
+          <w:sz w:val="20"/>
+        </w:rPr>
+        <w:t xml:space="preserve">• Cero material impreso: todo en el tablero, en el papel del estudiante o dictado. </w:t>
+      </w:r>
+      <w:r>
+        <w:rPr>
+          <w:sz w:val="20"/>
+        </w:rPr>
+        <w:t>Por qué: sin hoja, la atención está en el docente y en hablar; con hoja, el estudiante lee en vez de escuchar. Y el material de Heiiu es propiedad intelectual de la academia: la guía es solo para el docente y no se fotografía ni se comparte.</w:t>
+      </w:r>
+    </w:p>
+    <w:p>
+      <w:pPr>
+        <w:spacing w:after="40"/>
+        <w:ind w:left="283"/>
+      </w:pPr>
+      <w:r>
+        <w:rPr>
+          <w:b/>
+          <w:sz w:val="20"/>
+        </w:rPr>
+        <w:t xml:space="preserve">• Sin nombres de estudiantes en las guías, sin nombres de metodologías frente a ellos, sin notas de boca del docente. </w:t>
+      </w:r>
+      <w:r>
+        <w:rPr>
+          <w:sz w:val="20"/>
+        </w:rPr>
+        <w:t>Por qué: la guía es reutilizable y no lleva casos personales; los nombres de las técnicas son de la academia y no se enseñan; y las notas van por coordinación para que ningún estudiante negocie su resultado con su profesor.</w:t>
       </w:r>
     </w:p>
     <w:p>

</xml_diff>

<commit_message>
B1 2H: numeracion por pista 1-44 (Conv Cl 1 + Grammar Cl 1), mapa de hitos igual al B1 Mastery; guias derivan de las del B1 por pista; Conv Cl 2 resuelta
Co-Authored-By: Claude Fable 5.1 <noreply@anthropic.com>
</commit_message>
<xml_diff>
--- a/VERSION_2/B1_2H/SYLLABUS_B1_NOCTURNO_2H.docx
+++ b/VERSION_2/B1_2H/SYLLABUS_B1_NOCTURNO_2H.docx
@@ -40,7 +40,7 @@
           <w:color w:val="666666"/>
           <w:sz w:val="18"/>
         </w:rPr>
-        <w:t>Instrucciones para los dos docentes · Inicia 28 de septiembre de 2026 · 6:30 a 8:30 PM, lunes a viernes · 88 clases</w:t>
+        <w:t>Instrucciones para los dos docentes · Inicia 28 de septiembre de 2026 · 6:30 a 8:30 PM, lunes a viernes · 44 clases de Conversación + 44 de Gramática (88 noches)</w:t>
       </w:r>
     </w:p>
     <w:p>
@@ -65,7 +65,7 @@
           <w:b w:val="0"/>
           <w:sz w:val="20"/>
         </w:rPr>
-        <w:t>Es el mismo nivel B1 Mastery del cohorte de la mañana, pero en 2 horas diarias. En vez de dos clases el mismo día, las pistas se reparten por día de la semana:</w:t>
+        <w:t>Es el mismo nivel B1 Mastery: 44 clases de Conversación y 44 de Gramática, cada pista con su propia numeración del 1 al 44 y sus propias guías. En el formato de 4 horas las dos pistas se dan el mismo día; aquí, en 2 horas diarias, se reparten por día de la semana. El estudiante vive 88 noches:</w:t>
       </w:r>
     </w:p>
     <w:tbl>
@@ -304,7 +304,7 @@
           <w:b/>
           <w:sz w:val="20"/>
         </w:rPr>
-        <w:t>Hoy, Clase 1, abre Conversación. Mañana, Clase 2, Gramática. Cada docente recibe únicamente la guía de su día.</w:t>
+        <w:t>Hoy abre Conversación Cl 1. Mañana, Gramática Cl 1. Pasado mañana, Conversación Cl 2, y así. Cada docente recibe únicamente la guía de su día, numerada dentro de su pista.</w:t>
       </w:r>
     </w:p>
     <w:p>
@@ -658,7 +658,7 @@
           <w:b w:val="0"/>
           <w:sz w:val="20"/>
         </w:rPr>
-        <w:t>Cl 1-5 puente de repaso A1/A2 · Cl 6-43 módulos con simulaciones profesionales, con entrevistas simuladas en Cl 20 y Cl 36 · Cl 44 MIDTERM "My Story, My Goals" (5 min) · Cl 45-85 segunda mitad, con negociación en Cl 56 y Cl 70 y debate en Cl 62 y Cl 76 · Cl 80-84 taller de pitch · Cl 86-87 presentaciones finales en formato panel ("Shark Tank": 3 minutos ante tres compañeros que preguntan) · Cl 88 examen final con evaluador externo. Estos hitos llegan dentro de la guía del día; en la Clase 1 solo se anuncian las fechas del midterm y del final.</w:t>
+        <w:t>Los números son de cada pista (Cl 10 = Conversación Cl 10 y Gramática Cl 10, en noches consecutivas). Cl 1-5 puente de repaso A1/A2 · Cl 6-21 módulos con simulaciones profesionales, con entrevistas simuladas en Cl 10 y Cl 18 · Cl 22 MIDTERM "My Story, My Goals" (5 min) · Cl 23-42 segunda mitad, con negociación en Cl 28 y Cl 35 y debate en Cl 31 y Cl 38 · Cl 40-42 taller de pitch · Cl 43 presentaciones finales en formato panel ("Shark Tank": 3 minutos ante tres compañeros que preguntan) · Cl 44 cierre y examen final con evaluador externo, en la última noche. Estos hitos llegan dentro de la guía del día; en la Clase 1 solo se anuncian midterm y final.</w:t>
       </w:r>
     </w:p>
     <w:p>

</xml_diff>

<commit_message>
Syllabus (7): festivos sin clase y recuperados al final; portafolio guarda un video de hito cada 10 clases (Cl 10/20/30/40) ademas de entrada y salida
Co-Authored-By: Claude Fable 5.1 <noreply@anthropic.com>
</commit_message>
<xml_diff>
--- a/VERSION_2/B1_2H/SYLLABUS_B1_NOCTURNO_2H.docx
+++ b/VERSION_2/B1_2H/SYLLABUS_B1_NOCTURNO_2H.docx
@@ -316,6 +316,18 @@
           <w:b w:val="0"/>
           <w:sz w:val="20"/>
         </w:rPr>
+        <w:t>Festivos: no hay clase y no se reemplaza ese día. El docente del siguiente día hábil dicta la siguiente clase de SU pista, aunque eso ponga una Gramática antes de la Conversación del mismo número: se dicta igual y el PASE va en el otro sentido. Las clases perdidas por festivo se recuperan al final del nivel hasta completar todas las horas.</w:t>
+      </w:r>
+    </w:p>
+    <w:p>
+      <w:pPr>
+        <w:spacing w:after="60"/>
+      </w:pPr>
+      <w:r>
+        <w:rPr>
+          <w:b w:val="0"/>
+          <w:sz w:val="20"/>
+        </w:rPr>
         <w:t>Cuando un mismo docente dicta dos clases seguidas (viernes y lunes de Angie; jueves y viernes de Cristian), la segunda es de CONSOLIDACIÓN de su pista: en Conversación, producción extendida y simulación larga; en Gramática, taller de precisión y escritura. Ahí es donde caen los hitos del nivel (entrevistas simuladas, taller de pitch). La guía del día lo trae resuelto; el docente no tiene que decidirlo.</w:t>
       </w:r>
     </w:p>
@@ -437,7 +449,7 @@
         <w:rPr>
           <w:sz w:val="20"/>
         </w:rPr>
-        <w:t>cada estudiante graba un video de mínimo 3 minutos, hablado de corrido y sin leer, y lo envía el mismo día al grupo de WhatsApp del cohorte (donde están los dos docentes y Jacqueline). El grupo ES el archivo del portafolio: los videos diarios no se descargan. Solo se guardan en el computador de la academia la grabación de entrada y la de salida de cada nivel. Ya no es audio y ya no se queda en el celular. Audio solo por excepción, máximo 2 por semana. El docente del día VE los videos antes de la clase y anota al menos UNA cosa por mejorar de cada uno (una frase, con el error real). Al inicio de la clase, con la lista en mano, marca quién ENVIÓ y le dice a cada uno su mejora en voz alta, en 5 segundos. Video recibido + mejora anotada van al reporte de la noche. Es la revisión más importante del día: el video es la clase particular de cada estudiante.</w:t>
+        <w:t>cada estudiante graba un video de mínimo 3 minutos, hablado de corrido y sin leer, y lo envía el mismo día al grupo de WhatsApp del cohorte (donde están los dos docentes y Jacqueline). El grupo ES el archivo del portafolio: los videos diarios no se descargan. Solo se guardan en el computador de la academia la grabación de entrada, un video de hito cada 10 clases (Cl 10, 20, 30 y 40: el docente reenvía a la auxiliar administrativa, con el nombre, la grabación de esa noche de cada estudiante; en Cl 10 es la entrevista simulada) y la grabación de salida del nivel. Ya no es audio y ya no se queda en el celular. Audio solo por excepción, máximo 2 por semana. El docente del día VE los videos antes de la clase y anota al menos UNA cosa por mejorar de cada uno (una frase, con el error real). Al inicio de la clase, con la lista en mano, marca quién ENVIÓ y le dice a cada uno su mejora en voz alta, en 5 segundos. Video recibido + mejora anotada van al reporte de la noche. Es la revisión más importante del día: el video es la clase particular de cada estudiante.</w:t>
       </w:r>
     </w:p>
     <w:p>

</xml_diff>

<commit_message>
B1 2H Cl 1-12: pasada de doctrina completa (24/24 verde, verificar_b1_2h.py), 3 B3 de Grammar redisenados, continuidad Conv/Grammar; viernes alternos corregidos (2 y 9 oct), regla de desfase Grammar N tras Conv N+1 en syllabus
Co-Authored-By: Claude Fable 5.1 <noreply@anthropic.com>
</commit_message>
<xml_diff>
--- a/VERSION_2/B1_2H/SYLLABUS_B1_NOCTURNO_2H.docx
+++ b/VERSION_2/B1_2H/SYLLABUS_B1_NOCTURNO_2H.docx
@@ -205,7 +205,7 @@
               <w:rPr>
                 <w:sz w:val="19"/>
               </w:rPr>
-              <w:t>Lunes y miércoles, y viernes alternos (empieza el viernes 3 de octubre)</w:t>
+              <w:t>Lunes y miércoles, y viernes alternos (empieza el viernes 2 de octubre)</w:t>
             </w:r>
           </w:p>
         </w:tc>
@@ -273,7 +273,7 @@
               <w:rPr>
                 <w:sz w:val="19"/>
               </w:rPr>
-              <w:t>Martes y jueves, y viernes alternos (empieza el viernes 10 de octubre)</w:t>
+              <w:t>Martes y jueves, y viernes alternos (empieza el viernes 9 de octubre)</w:t>
             </w:r>
           </w:p>
         </w:tc>
@@ -317,6 +317,18 @@
           <w:sz w:val="20"/>
         </w:rPr>
         <w:t>Festivos: no hay clase y no se reemplaza ese día. El docente del siguiente día hábil dicta la siguiente clase de SU pista, aunque eso ponga una Gramática antes de la Conversación del mismo número: se dicta igual y el PASE va en el otro sentido. Las clases perdidas por festivo se recuperan al final del nivel hasta completar todas las horas.</w:t>
+      </w:r>
+    </w:p>
+    <w:p>
+      <w:pPr>
+        <w:spacing w:after="60"/>
+      </w:pPr>
+      <w:r>
+        <w:rPr>
+          <w:b w:val="0"/>
+          <w:sz w:val="20"/>
+        </w:rPr>
+        <w:t>Por los viernes alternos, a veces Gramática N se dicta después de Conversación N+1 (por ejemplo, Gramática 3 el martes, cuando Conversación 4 ya pasó el lunes). Es normal y está previsto: Gramática N siempre sella la clase de Conversación del MISMO número, y el PASE de esa Conversación se guarda en el grupo hasta esa noche. Cuando una guía diga "mañana" o "ayer", léase "la próxima clase de esa pista" o "la última clase de esa pista".</w:t>
       </w:r>
     </w:p>
     <w:p>

</xml_diff>